<commit_message>
Update R packages and rerun code.
</commit_message>
<xml_diff>
--- a/reports/Cohort_A/Harmonisation-Template-for-Cohort-A.docx
+++ b/reports/Cohort_A/Harmonisation-Template-for-Cohort-A.docx
@@ -1855,7 +1855,7 @@
               <w:jc w:val="left"/>
             </w:pPr>
             <w:r>
-              <w:t xml:space="preserve">RSPM (R 4.5.0)</w:t>
+              <w:t xml:space="preserve">RSPM</w:t>
             </w:r>
           </w:p>
         </w:tc>
@@ -1905,7 +1905,7 @@
               <w:jc w:val="left"/>
             </w:pPr>
             <w:r>
-              <w:t xml:space="preserve">RSPM (R 4.5.0)</w:t>
+              <w:t xml:space="preserve">RSPM</w:t>
             </w:r>
           </w:p>
         </w:tc>
@@ -1931,7 +1931,7 @@
               <w:jc w:val="left"/>
             </w:pPr>
             <w:r>
-              <w:t xml:space="preserve">1.0.0</w:t>
+              <w:t xml:space="preserve">1.0.1</w:t>
             </w:r>
           </w:p>
         </w:tc>
@@ -1943,7 +1943,7 @@
               <w:jc w:val="left"/>
             </w:pPr>
             <w:r>
-              <w:t xml:space="preserve">2023-01-29</w:t>
+              <w:t xml:space="preserve">2025-09-25</w:t>
             </w:r>
           </w:p>
         </w:tc>
@@ -1955,7 +1955,7 @@
               <w:jc w:val="left"/>
             </w:pPr>
             <w:r>
-              <w:t xml:space="preserve">RSPM (R 4.5.0)</w:t>
+              <w:t xml:space="preserve">RSPM</w:t>
             </w:r>
           </w:p>
         </w:tc>
@@ -2005,7 +2005,7 @@
               <w:jc w:val="left"/>
             </w:pPr>
             <w:r>
-              <w:t xml:space="preserve">RSPM (R 4.5.0)</w:t>
+              <w:t xml:space="preserve">RSPM</w:t>
             </w:r>
           </w:p>
         </w:tc>
@@ -2043,7 +2043,7 @@
               <w:jc w:val="left"/>
             </w:pPr>
             <w:r>
-              <w:t xml:space="preserve">2025-05-20</w:t>
+              <w:t xml:space="preserve">2025-11-12</w:t>
             </w:r>
           </w:p>
         </w:tc>
@@ -2081,7 +2081,7 @@
               <w:jc w:val="left"/>
             </w:pPr>
             <w:r>
-              <w:t xml:space="preserve">1.0.1</w:t>
+              <w:t xml:space="preserve">1.0.2</w:t>
             </w:r>
           </w:p>
         </w:tc>
@@ -2093,7 +2093,7 @@
               <w:jc w:val="left"/>
             </w:pPr>
             <w:r>
-              <w:t xml:space="preserve">2020-12-13</w:t>
+              <w:t xml:space="preserve">2025-09-15</w:t>
             </w:r>
           </w:p>
         </w:tc>
@@ -2105,7 +2105,7 @@
               <w:jc w:val="left"/>
             </w:pPr>
             <w:r>
-              <w:t xml:space="preserve">RSPM (R 4.5.0)</w:t>
+              <w:t xml:space="preserve">RSPM</w:t>
             </w:r>
           </w:p>
         </w:tc>
@@ -2131,7 +2131,7 @@
               <w:jc w:val="left"/>
             </w:pPr>
             <w:r>
-              <w:t xml:space="preserve">0.5.8.1</w:t>
+              <w:t xml:space="preserve">0.5.8.9000</w:t>
             </w:r>
           </w:p>
         </w:tc>
@@ -2143,7 +2143,7 @@
               <w:jc w:val="left"/>
             </w:pPr>
             <w:r>
-              <w:t xml:space="preserve">2024-04-04</w:t>
+              <w:t xml:space="preserve">2024-06-07</w:t>
             </w:r>
           </w:p>
         </w:tc>
@@ -2155,7 +2155,7 @@
               <w:jc w:val="left"/>
             </w:pPr>
             <w:r>
-              <w:t xml:space="preserve">RSPM (R 4.5.0)</w:t>
+              <w:t xml:space="preserve">https://j~</w:t>
             </w:r>
           </w:p>
         </w:tc>
@@ -2181,7 +2181,7 @@
               <w:jc w:val="left"/>
             </w:pPr>
             <w:r>
-              <w:t xml:space="preserve">2.0.3</w:t>
+              <w:t xml:space="preserve">2.0.4</w:t>
             </w:r>
           </w:p>
         </w:tc>
@@ -2193,7 +2193,7 @@
               <w:jc w:val="left"/>
             </w:pPr>
             <w:r>
-              <w:t xml:space="preserve">2022-03-30</w:t>
+              <w:t xml:space="preserve">2025-09-12</w:t>
             </w:r>
           </w:p>
         </w:tc>
@@ -2205,7 +2205,7 @@
               <w:jc w:val="left"/>
             </w:pPr>
             <w:r>
-              <w:t xml:space="preserve">RSPM (R 4.5.0)</w:t>
+              <w:t xml:space="preserve">RSPM</w:t>
             </w:r>
           </w:p>
         </w:tc>
@@ -2219,7 +2219,7 @@
               <w:jc w:val="left"/>
             </w:pPr>
             <w:r>
-              <w:t xml:space="preserve">openxlsx</w:t>
+              <w:t xml:space="preserve">nanoparquet</w:t>
             </w:r>
           </w:p>
         </w:tc>
@@ -2231,7 +2231,7 @@
               <w:jc w:val="left"/>
             </w:pPr>
             <w:r>
-              <w:t xml:space="preserve">4.2.8</w:t>
+              <w:t xml:space="preserve">0.4.2</w:t>
             </w:r>
           </w:p>
         </w:tc>
@@ -2243,7 +2243,7 @@
               <w:jc w:val="left"/>
             </w:pPr>
             <w:r>
-              <w:t xml:space="preserve">2025-01-25</w:t>
+              <w:t xml:space="preserve">2025-02-22</w:t>
             </w:r>
           </w:p>
         </w:tc>
@@ -2255,7 +2255,7 @@
               <w:jc w:val="left"/>
             </w:pPr>
             <w:r>
-              <w:t xml:space="preserve">RSPM (R 4.5.0)</w:t>
+              <w:t xml:space="preserve">RSPM</w:t>
             </w:r>
           </w:p>
         </w:tc>
@@ -2269,7 +2269,7 @@
               <w:jc w:val="left"/>
             </w:pPr>
             <w:r>
-              <w:t xml:space="preserve">pointblank</w:t>
+              <w:t xml:space="preserve">openxlsx</w:t>
             </w:r>
           </w:p>
         </w:tc>
@@ -2281,7 +2281,7 @@
               <w:jc w:val="left"/>
             </w:pPr>
             <w:r>
-              <w:t xml:space="preserve">0.12.2</w:t>
+              <w:t xml:space="preserve">4.2.8.1</w:t>
             </w:r>
           </w:p>
         </w:tc>
@@ -2293,7 +2293,7 @@
               <w:jc w:val="left"/>
             </w:pPr>
             <w:r>
-              <w:t xml:space="preserve">2024-10-23</w:t>
+              <w:t xml:space="preserve">2025-10-31</w:t>
             </w:r>
           </w:p>
         </w:tc>
@@ -2305,7 +2305,7 @@
               <w:jc w:val="left"/>
             </w:pPr>
             <w:r>
-              <w:t xml:space="preserve">RSPM (R 4.5.0)</w:t>
+              <w:t xml:space="preserve">RSPM</w:t>
             </w:r>
           </w:p>
         </w:tc>
@@ -2319,7 +2319,7 @@
               <w:jc w:val="left"/>
             </w:pPr>
             <w:r>
-              <w:t xml:space="preserve">purrr</w:t>
+              <w:t xml:space="preserve">pointblank</w:t>
             </w:r>
           </w:p>
         </w:tc>
@@ -2331,7 +2331,7 @@
               <w:jc w:val="left"/>
             </w:pPr>
             <w:r>
-              <w:t xml:space="preserve">1.0.4</w:t>
+              <w:t xml:space="preserve">0.12.2</w:t>
             </w:r>
           </w:p>
         </w:tc>
@@ -2343,7 +2343,7 @@
               <w:jc w:val="left"/>
             </w:pPr>
             <w:r>
-              <w:t xml:space="preserve">2025-02-05</w:t>
+              <w:t xml:space="preserve">2024-10-23</w:t>
             </w:r>
           </w:p>
         </w:tc>
@@ -2355,7 +2355,7 @@
               <w:jc w:val="left"/>
             </w:pPr>
             <w:r>
-              <w:t xml:space="preserve">RSPM (R 4.5.0)</w:t>
+              <w:t xml:space="preserve">RSPM</w:t>
             </w:r>
           </w:p>
         </w:tc>
@@ -2369,7 +2369,7 @@
               <w:jc w:val="left"/>
             </w:pPr>
             <w:r>
-              <w:t xml:space="preserve">quarto</w:t>
+              <w:t xml:space="preserve">purrr</w:t>
             </w:r>
           </w:p>
         </w:tc>
@@ -2381,7 +2381,7 @@
               <w:jc w:val="left"/>
             </w:pPr>
             <w:r>
-              <w:t xml:space="preserve">1.4.4</w:t>
+              <w:t xml:space="preserve">1.2.0</w:t>
             </w:r>
           </w:p>
         </w:tc>
@@ -2393,7 +2393,7 @@
               <w:jc w:val="left"/>
             </w:pPr>
             <w:r>
-              <w:t xml:space="preserve">2024-07-20</w:t>
+              <w:t xml:space="preserve">2025-11-04</w:t>
             </w:r>
           </w:p>
         </w:tc>
@@ -2405,7 +2405,7 @@
               <w:jc w:val="left"/>
             </w:pPr>
             <w:r>
-              <w:t xml:space="preserve">RSPM (R 4.5.0)</w:t>
+              <w:t xml:space="preserve">RSPM</w:t>
             </w:r>
           </w:p>
         </w:tc>
@@ -2419,7 +2419,7 @@
               <w:jc w:val="left"/>
             </w:pPr>
             <w:r>
-              <w:t xml:space="preserve">reactable</w:t>
+              <w:t xml:space="preserve">quarto</w:t>
             </w:r>
           </w:p>
         </w:tc>
@@ -2431,7 +2431,7 @@
               <w:jc w:val="left"/>
             </w:pPr>
             <w:r>
-              <w:t xml:space="preserve">0.4.4</w:t>
+              <w:t xml:space="preserve">1.5.1</w:t>
             </w:r>
           </w:p>
         </w:tc>
@@ -2443,7 +2443,7 @@
               <w:jc w:val="left"/>
             </w:pPr>
             <w:r>
-              <w:t xml:space="preserve">2023-03-12</w:t>
+              <w:t xml:space="preserve">2025-09-04</w:t>
             </w:r>
           </w:p>
         </w:tc>
@@ -2455,7 +2455,7 @@
               <w:jc w:val="left"/>
             </w:pPr>
             <w:r>
-              <w:t xml:space="preserve">RSPM (R 4.5.0)</w:t>
+              <w:t xml:space="preserve">RSPM</w:t>
             </w:r>
           </w:p>
         </w:tc>
@@ -2469,7 +2469,7 @@
               <w:jc w:val="left"/>
             </w:pPr>
             <w:r>
-              <w:t xml:space="preserve">readxl</w:t>
+              <w:t xml:space="preserve">reactable</w:t>
             </w:r>
           </w:p>
         </w:tc>
@@ -2481,7 +2481,7 @@
               <w:jc w:val="left"/>
             </w:pPr>
             <w:r>
-              <w:t xml:space="preserve">1.4.4</w:t>
+              <w:t xml:space="preserve">0.4.4</w:t>
             </w:r>
           </w:p>
         </w:tc>
@@ -2493,7 +2493,7 @@
               <w:jc w:val="left"/>
             </w:pPr>
             <w:r>
-              <w:t xml:space="preserve">2025-02-27</w:t>
+              <w:t xml:space="preserve">2023-03-12</w:t>
             </w:r>
           </w:p>
         </w:tc>
@@ -2505,7 +2505,7 @@
               <w:jc w:val="left"/>
             </w:pPr>
             <w:r>
-              <w:t xml:space="preserve">RSPM (R 4.5.0)</w:t>
+              <w:t xml:space="preserve">RSPM</w:t>
             </w:r>
           </w:p>
         </w:tc>
@@ -2519,7 +2519,7 @@
               <w:jc w:val="left"/>
             </w:pPr>
             <w:r>
-              <w:t xml:space="preserve">sessioninfo</w:t>
+              <w:t xml:space="preserve">readxl</w:t>
             </w:r>
           </w:p>
         </w:tc>
@@ -2531,7 +2531,7 @@
               <w:jc w:val="left"/>
             </w:pPr>
             <w:r>
-              <w:t xml:space="preserve">1.2.2</w:t>
+              <w:t xml:space="preserve">1.4.5</w:t>
             </w:r>
           </w:p>
         </w:tc>
@@ -2543,7 +2543,7 @@
               <w:jc w:val="left"/>
             </w:pPr>
             <w:r>
-              <w:t xml:space="preserve">2021-12-06</w:t>
+              <w:t xml:space="preserve">2025-03-07</w:t>
             </w:r>
           </w:p>
         </w:tc>
@@ -2555,7 +2555,7 @@
               <w:jc w:val="left"/>
             </w:pPr>
             <w:r>
-              <w:t xml:space="preserve">CRAN (R 4.5.0)</w:t>
+              <w:t xml:space="preserve">RSPM</w:t>
             </w:r>
           </w:p>
         </w:tc>
@@ -2569,7 +2569,7 @@
               <w:jc w:val="left"/>
             </w:pPr>
             <w:r>
-              <w:t xml:space="preserve">stringr</w:t>
+              <w:t xml:space="preserve">sessioninfo</w:t>
             </w:r>
           </w:p>
         </w:tc>
@@ -2581,7 +2581,7 @@
               <w:jc w:val="left"/>
             </w:pPr>
             <w:r>
-              <w:t xml:space="preserve">1.5.1</w:t>
+              <w:t xml:space="preserve">1.2.3</w:t>
             </w:r>
           </w:p>
         </w:tc>
@@ -2593,7 +2593,7 @@
               <w:jc w:val="left"/>
             </w:pPr>
             <w:r>
-              <w:t xml:space="preserve">2023-11-14</w:t>
+              <w:t xml:space="preserve">2025-02-05</w:t>
             </w:r>
           </w:p>
         </w:tc>
@@ -2605,7 +2605,7 @@
               <w:jc w:val="left"/>
             </w:pPr>
             <w:r>
-              <w:t xml:space="preserve">RSPM (R 4.5.0)</w:t>
+              <w:t xml:space="preserve">RSPM</w:t>
             </w:r>
           </w:p>
         </w:tc>
@@ -2619,7 +2619,7 @@
               <w:jc w:val="left"/>
             </w:pPr>
             <w:r>
-              <w:t xml:space="preserve">testthat</w:t>
+              <w:t xml:space="preserve">stringr</w:t>
             </w:r>
           </w:p>
         </w:tc>
@@ -2631,7 +2631,7 @@
               <w:jc w:val="left"/>
             </w:pPr>
             <w:r>
-              <w:t xml:space="preserve">3.2.3</w:t>
+              <w:t xml:space="preserve">1.6.0</w:t>
             </w:r>
           </w:p>
         </w:tc>
@@ -2643,7 +2643,7 @@
               <w:jc w:val="left"/>
             </w:pPr>
             <w:r>
-              <w:t xml:space="preserve">2025-01-13</w:t>
+              <w:t xml:space="preserve">2025-11-04</w:t>
             </w:r>
           </w:p>
         </w:tc>
@@ -2655,7 +2655,7 @@
               <w:jc w:val="left"/>
             </w:pPr>
             <w:r>
-              <w:t xml:space="preserve">RSPM (R 4.5.0)</w:t>
+              <w:t xml:space="preserve">RSPM</w:t>
             </w:r>
           </w:p>
         </w:tc>
@@ -2669,7 +2669,7 @@
               <w:jc w:val="left"/>
             </w:pPr>
             <w:r>
-              <w:t xml:space="preserve">tibble</w:t>
+              <w:t xml:space="preserve">testthat</w:t>
             </w:r>
           </w:p>
         </w:tc>
@@ -2681,7 +2681,7 @@
               <w:jc w:val="left"/>
             </w:pPr>
             <w:r>
-              <w:t xml:space="preserve">3.2.1</w:t>
+              <w:t xml:space="preserve">3.2.3</w:t>
             </w:r>
           </w:p>
         </w:tc>
@@ -2693,7 +2693,7 @@
               <w:jc w:val="left"/>
             </w:pPr>
             <w:r>
-              <w:t xml:space="preserve">2023-03-20</w:t>
+              <w:t xml:space="preserve">2025-01-13</w:t>
             </w:r>
           </w:p>
         </w:tc>
@@ -2705,7 +2705,7 @@
               <w:jc w:val="left"/>
             </w:pPr>
             <w:r>
-              <w:t xml:space="preserve">RSPM (R 4.5.0)</w:t>
+              <w:t xml:space="preserve">RSPM</w:t>
             </w:r>
           </w:p>
         </w:tc>
@@ -2719,6 +2719,56 @@
               <w:jc w:val="left"/>
             </w:pPr>
             <w:r>
+              <w:t xml:space="preserve">tibble</w:t>
+            </w:r>
+          </w:p>
+        </w:tc>
+        <w:tc>
+          <w:tcPr/>
+          <w:p>
+            <w:pPr>
+              <w:pStyle w:val="Compact"/>
+              <w:jc w:val="left"/>
+            </w:pPr>
+            <w:r>
+              <w:t xml:space="preserve">3.3.0</w:t>
+            </w:r>
+          </w:p>
+        </w:tc>
+        <w:tc>
+          <w:tcPr/>
+          <w:p>
+            <w:pPr>
+              <w:pStyle w:val="Compact"/>
+              <w:jc w:val="left"/>
+            </w:pPr>
+            <w:r>
+              <w:t xml:space="preserve">2025-06-08</w:t>
+            </w:r>
+          </w:p>
+        </w:tc>
+        <w:tc>
+          <w:tcPr/>
+          <w:p>
+            <w:pPr>
+              <w:pStyle w:val="Compact"/>
+              <w:jc w:val="left"/>
+            </w:pPr>
+            <w:r>
+              <w:t xml:space="preserve">RSPM</w:t>
+            </w:r>
+          </w:p>
+        </w:tc>
+      </w:tr>
+      <w:tr>
+        <w:tc>
+          <w:tcPr/>
+          <w:p>
+            <w:pPr>
+              <w:pStyle w:val="Compact"/>
+              <w:jc w:val="left"/>
+            </w:pPr>
+            <w:r>
               <w:t xml:space="preserve">tidyr</w:t>
             </w:r>
           </w:p>
@@ -2755,7 +2805,7 @@
               <w:jc w:val="left"/>
             </w:pPr>
             <w:r>
-              <w:t xml:space="preserve">RSPM (R 4.5.0)</w:t>
+              <w:t xml:space="preserve">RSPM</w:t>
             </w:r>
           </w:p>
         </w:tc>
@@ -2855,8 +2905,8 @@
         <w:tblLook w:firstRow="1" w:lastRow="0" w:firstColumn="0" w:lastColumn="0" w:noHBand="0" w:noVBand="0" w:val="0020"/>
       </w:tblPr>
       <w:tblGrid>
-        <w:gridCol w:w="774"/>
-        <w:gridCol w:w="7145"/>
+        <w:gridCol w:w="758"/>
+        <w:gridCol w:w="7161"/>
       </w:tblGrid>
       <w:tr>
         <w:trPr>
@@ -2908,7 +2958,7 @@
               <w:jc w:val="left"/>
             </w:pPr>
             <w:r>
-              <w:t xml:space="preserve">R version 4.5.0 (2025-04-11 ucrt)</w:t>
+              <w:t xml:space="preserve">R version 4.5.1 (2025-06-13 ucrt)</w:t>
             </w:r>
           </w:p>
         </w:tc>
@@ -2934,7 +2984,7 @@
               <w:jc w:val="left"/>
             </w:pPr>
             <w:r>
-              <w:t xml:space="preserve">Windows 11 x64 (build 26100)</w:t>
+              <w:t xml:space="preserve">Windows 11 x64 (build 26200)</w:t>
             </w:r>
           </w:p>
         </w:tc>
@@ -3116,7 +3166,7 @@
               <w:jc w:val="left"/>
             </w:pPr>
             <w:r>
-              <w:t xml:space="preserve">2025-06-11</w:t>
+              <w:t xml:space="preserve">2025-11-12</w:t>
             </w:r>
           </w:p>
         </w:tc>
@@ -3142,7 +3192,7 @@
               <w:jc w:val="left"/>
             </w:pPr>
             <w:r>
-              <w:t xml:space="preserve">3.4 @ C:/Program Files/RStudio/resources/app/bin/quarto/bin/tools/ (via rmarkdown)</w:t>
+              <w:t xml:space="preserve">3.6.3 @ C:/Program Files/RStudio/resources/app/bin/quarto/bin/tools/ (via rmarkdown)</w:t>
             </w:r>
           </w:p>
         </w:tc>
@@ -3168,7 +3218,7 @@
               <w:jc w:val="left"/>
             </w:pPr>
             <w:r>
-              <w:t xml:space="preserve">1.7.30 @ C:/Program Files/Quarto/bin/quarto.exe/ (via quarto)</w:t>
+              <w:t xml:space="preserve">1.8.21 @ C:/Program Files/Quarto/bin/quarto.exe/ (via quarto)</w:t>
             </w:r>
           </w:p>
         </w:tc>
@@ -3194,7 +3244,7 @@
               <w:jc w:val="left"/>
             </w:pPr>
             <w:r>
-              <w:t xml:space="preserve">1.49 from RSPM (R 4.5.0)</w:t>
+              <w:t xml:space="preserve">1.50 from RSPM</w:t>
             </w:r>
           </w:p>
         </w:tc>

</xml_diff>

<commit_message>
Update to parquet as preprocessing data.
</commit_message>
<xml_diff>
--- a/reports/Cohort_A/Harmonisation-Template-for-Cohort-A.docx
+++ b/reports/Cohort_A/Harmonisation-Template-for-Cohort-A.docx
@@ -8171,13 +8171,19 @@
         <w:t xml:space="preserve">|&gt;</w:t>
       </w:r>
       <w:r>
-        <w:br/>
-      </w:r>
-      <w:r>
-        <w:rPr>
-          <w:rStyle w:val="NormalTok"/>
-        </w:rPr>
-        <w:t xml:space="preserve">  fst</w:t>
+        <w:rPr>
+          <w:rStyle w:val="NormalTok"/>
+        </w:rPr>
+        <w:t xml:space="preserve"> </w:t>
+      </w:r>
+      <w:r>
+        <w:br/>
+      </w:r>
+      <w:r>
+        <w:rPr>
+          <w:rStyle w:val="NormalTok"/>
+        </w:rPr>
+        <w:t xml:space="preserve">  nanoparquet</w:t>
       </w:r>
       <w:r>
         <w:rPr>
@@ -8189,7 +8195,7 @@
         <w:rPr>
           <w:rStyle w:val="FunctionTok"/>
         </w:rPr>
-        <w:t xml:space="preserve">write_fst</w:t>
+        <w:t xml:space="preserve">write_parquet</w:t>
       </w:r>
       <w:r>
         <w:rPr>
@@ -8210,7 +8216,7 @@
         <w:rPr>
           <w:rStyle w:val="AttributeTok"/>
         </w:rPr>
-        <w:t xml:space="preserve">path =</w:t>
+        <w:t xml:space="preserve">file =</w:t>
       </w:r>
       <w:r>
         <w:rPr>
@@ -8234,7 +8240,16 @@
         <w:rPr>
           <w:rStyle w:val="NormalTok"/>
         </w:rPr>
-        <w:t xml:space="preserve">(params</w:t>
+        <w:t xml:space="preserve">(</w:t>
+      </w:r>
+      <w:r>
+        <w:br/>
+      </w:r>
+      <w:r>
+        <w:rPr>
+          <w:rStyle w:val="NormalTok"/>
+        </w:rPr>
+        <w:t xml:space="preserve">      params</w:t>
       </w:r>
       <w:r>
         <w:rPr>
@@ -8255,7 +8270,7 @@
         <w:rPr>
           <w:rStyle w:val="NormalTok"/>
         </w:rPr>
-        <w:t xml:space="preserve">                      params</w:t>
+        <w:t xml:space="preserve">      params</w:t>
       </w:r>
       <w:r>
         <w:rPr>
@@ -8276,7 +8291,7 @@
         <w:rPr>
           <w:rStyle w:val="NormalTok"/>
         </w:rPr>
-        <w:t xml:space="preserve">                      params</w:t>
+        <w:t xml:space="preserve">      params</w:t>
       </w:r>
       <w:r>
         <w:rPr>
@@ -8297,19 +8312,22 @@
         <w:rPr>
           <w:rStyle w:val="NormalTok"/>
         </w:rPr>
-        <w:t xml:space="preserve">                      </w:t>
-      </w:r>
-      <w:r>
-        <w:rPr>
-          <w:rStyle w:val="StringTok"/>
-        </w:rPr>
-        <w:t xml:space="preserve">"01_Cohort_A_cleaned.fst"</w:t>
-      </w:r>
-      <w:r>
-        <w:rPr>
-          <w:rStyle w:val="NormalTok"/>
-        </w:rPr>
-        <w:t xml:space="preserve">)</w:t>
+        <w:t xml:space="preserve">      </w:t>
+      </w:r>
+      <w:r>
+        <w:rPr>
+          <w:rStyle w:val="StringTok"/>
+        </w:rPr>
+        <w:t xml:space="preserve">"01_Cohort_A_cleaned.parquet"</w:t>
+      </w:r>
+      <w:r>
+        <w:br/>
+      </w:r>
+      <w:r>
+        <w:rPr>
+          <w:rStyle w:val="NormalTok"/>
+        </w:rPr>
+        <w:t xml:space="preserve">  )</w:t>
       </w:r>
       <w:r>
         <w:br/>
@@ -25356,7 +25374,7 @@
         <w:rPr>
           <w:rStyle w:val="NormalTok"/>
         </w:rPr>
-        <w:t xml:space="preserve">  fst</w:t>
+        <w:t xml:space="preserve">  nanoparquet</w:t>
       </w:r>
       <w:r>
         <w:rPr>
@@ -25368,7 +25386,7 @@
         <w:rPr>
           <w:rStyle w:val="FunctionTok"/>
         </w:rPr>
-        <w:t xml:space="preserve">write_fst</w:t>
+        <w:t xml:space="preserve">write_parquet</w:t>
       </w:r>
       <w:r>
         <w:rPr>
@@ -25389,7 +25407,7 @@
         <w:rPr>
           <w:rStyle w:val="AttributeTok"/>
         </w:rPr>
-        <w:t xml:space="preserve">path =</w:t>
+        <w:t xml:space="preserve">file =</w:t>
       </w:r>
       <w:r>
         <w:rPr>
@@ -25491,22 +25509,25 @@
         <w:rPr>
           <w:rStyle w:val="StringTok"/>
         </w:rPr>
-        <w:t xml:space="preserve">"02_demographic_data.fst"</w:t>
-      </w:r>
-      <w:r>
-        <w:rPr>
-          <w:rStyle w:val="NormalTok"/>
-        </w:rPr>
-        <w:t xml:space="preserve">),</w:t>
-      </w:r>
-      <w:r>
-        <w:br/>
-      </w:r>
-      <w:r>
-        <w:rPr>
-          <w:rStyle w:val="NormalTok"/>
-        </w:rPr>
-        <w:t xml:space="preserve">)</w:t>
+        <w:t xml:space="preserve">"02_demographic_data.parquet"</w:t>
+      </w:r>
+      <w:r>
+        <w:br/>
+      </w:r>
+      <w:r>
+        <w:rPr>
+          <w:rStyle w:val="NormalTok"/>
+        </w:rPr>
+        <w:t xml:space="preserve">  )</w:t>
+      </w:r>
+      <w:r>
+        <w:br/>
+      </w:r>
+      <w:r>
+        <w:rPr>
+          <w:rStyle w:val="NormalTok"/>
+        </w:rPr>
+        <w:t xml:space="preserve">)  </w:t>
       </w:r>
     </w:p>
     <w:bookmarkEnd w:id="52"/>

</xml_diff>